<commit_message>
scenarios 2, 3, 4: embed full speaker director cards with roles, emotions, metamessages and voice/body dynamics for 100% course completion
</commit_message>
<xml_diff>
--- a/baza/исходник миникурса/3 сценарий/Сценарий_3_Мы_вместе_ПОЛНЫЙ_КУРС.docx
+++ b/baza/исходник миникурса/3 сценарий/Сценарий_3_Мы_вместе_ПОЛНЫЙ_КУРС.docx
@@ -4,7 +4,7 @@
   <w:body>
     <w:p>
       <w:pPr>
-        <w:spacing w:after="160"/>
+        <w:spacing w:after="40"/>
         <w:jc w:val="center"/>
       </w:pPr>
       <w:r>
@@ -12,52 +12,51 @@
           <w:rFonts w:ascii="Calibri" w:hAnsi="Calibri"/>
           <w:b/>
           <w:color w:val="1F4E5B"/>
-          <w:sz w:val="44"/>
+          <w:sz w:val="34"/>
         </w:rPr>
-        <w:t>СЦЕНАРИЙ 3: «МЫ ВМЕСТЕ» (family)</w:t>
+        <w:t>КУРС «МЫ ВМЕСТЕ: ПЕРЕЗАГРУЗКА ЗРЕЛЫХ ОТНОШЕНИЙ» (СЦЕНАРИЙ 3)</w:t>
       </w:r>
     </w:p>
     <w:p>
       <w:pPr>
-        <w:spacing w:after="400"/>
+        <w:spacing w:after="280"/>
         <w:jc w:val="center"/>
       </w:pPr>
       <w:r>
         <w:rPr>
           <w:rFonts w:ascii="Calibri" w:hAnsi="Calibri"/>
           <w:i/>
-          <w:color w:val="5A6B73"/>
-          <w:sz w:val="24"/>
+          <w:color w:val="555555"/>
+          <w:sz w:val="21"/>
         </w:rPr>
-        <w:t>Полная чистовая программа курса, сценарии видео, интерактивы и бонусы</w:t>
+        <w:t>Генеральный мастер-пакет: видео-суфлеры, аудиопрактики, интерактивы, бонусы и режиссёрские карты</w:t>
         <w:br/>
-        <w:t>Автор: Анатолий Фёдоров | Система: СПА и исследования Джона Готтмана</w:t>
+        <w:t>Автор: Федоров Анатолий Игоревич (Семейный психолог, гипнолог, проректор МАГиГ)</w:t>
       </w:r>
     </w:p>
     <w:p>
       <w:pPr>
-        <w:spacing w:before="320" w:after="120"/>
+        <w:spacing w:before="240" w:after="60"/>
       </w:pPr>
       <w:r>
         <w:rPr>
           <w:rFonts w:ascii="Calibri" w:hAnsi="Calibri"/>
           <w:b/>
           <w:color w:val="1F4E5B"/>
-          <w:sz w:val="30"/>
+          <w:sz w:val="25"/>
         </w:rPr>
-        <w:t>1. ПАСПОРТ СЦЕНАРИЯ И МАРШРУТА</w:t>
+        <w:t>1. МЕТОДОЛОГИЧЕСКИЙ ПАСПОРТ СЦЕНАРИЯ 3</w:t>
       </w:r>
     </w:p>
     <w:p>
       <w:pPr>
-        <w:spacing w:after="100" w:line="276" w:lineRule="auto"/>
+        <w:spacing w:after="80" w:line="276" w:lineRule="auto"/>
       </w:pPr>
       <w:r>
         <w:rPr>
           <w:rFonts w:ascii="Calibri" w:hAnsi="Calibri"/>
           <w:b/>
-          <w:color w:val="222222"/>
-          <w:sz w:val="22"/>
+          <w:sz w:val="20"/>
         </w:rPr>
         <w:t xml:space="preserve">Целевая аудитория: </w:t>
       </w:r>
@@ -65,1155 +64,929 @@
         <w:rPr>
           <w:rFonts w:ascii="Calibri" w:hAnsi="Calibri"/>
           <w:i w:val="0"/>
-          <w:color w:val="333333"/>
-          <w:sz w:val="22"/>
+          <w:sz w:val="20"/>
         </w:rPr>
-        <w:t>Длительный брак или сожительство (7–25+ лет).</w:t>
+        <w:t>Мужчины и женщины в браке или сожительстве от 7 до 25 лет (возраст 35–55 лет). Главные симптомы: бытовая глухота, жизнь как соседи по квартире, потеря нежности и секса, бесконечные одинаковые ссоры, переходящие в многодневное молчание.</w:t>
       </w:r>
     </w:p>
     <w:p>
       <w:pPr>
-        <w:spacing w:after="100" w:line="276" w:lineRule="auto"/>
+        <w:spacing w:after="80" w:line="276" w:lineRule="auto"/>
       </w:pPr>
       <w:r>
         <w:rPr>
           <w:rFonts w:ascii="Calibri" w:hAnsi="Calibri"/>
           <w:b/>
-          <w:color w:val="222222"/>
-          <w:sz w:val="22"/>
+          <w:sz w:val="20"/>
         </w:rPr>
-        <w:t xml:space="preserve">Ключевая проблема: </w:t>
+        <w:t xml:space="preserve">Психотерапевтическая база: </w:t>
       </w:r>
       <w:r>
         <w:rPr>
           <w:rFonts w:ascii="Calibri" w:hAnsi="Calibri"/>
           <w:i w:val="0"/>
-          <w:color w:val="333333"/>
-          <w:sz w:val="22"/>
+          <w:sz w:val="20"/>
         </w:rPr>
-        <w:t>Бытовое отчуждение («соседи по комнате»), угасший секс, охлаждение, накопленная тишина и невысказанные обиды, страх провести остаток жизни в унылом сожительстве.</w:t>
+        <w:t>Клинический метод Джона Готтмана (John Gottman — протокол физиологического самоуспокоения Physiological Self-Soothing) + Системная семейная терапия.</w:t>
       </w:r>
     </w:p>
     <w:p>
       <w:pPr>
-        <w:spacing w:after="100" w:line="276" w:lineRule="auto"/>
+        <w:spacing w:after="80" w:line="276" w:lineRule="auto"/>
       </w:pPr>
       <w:r>
         <w:rPr>
           <w:rFonts w:ascii="Calibri" w:hAnsi="Calibri"/>
           <w:b/>
-          <w:color w:val="222222"/>
-          <w:sz w:val="22"/>
+          <w:sz w:val="20"/>
         </w:rPr>
-        <w:t xml:space="preserve">Главная задача курса: </w:t>
+        <w:t xml:space="preserve">Реальная цель без завышенных ожиданий: </w:t>
       </w:r>
       <w:r>
         <w:rPr>
           <w:rFonts w:ascii="Calibri" w:hAnsi="Calibri"/>
           <w:i w:val="0"/>
-          <w:color w:val="333333"/>
-          <w:sz w:val="22"/>
+          <w:sz w:val="20"/>
         </w:rPr>
-        <w:t>Не спасать семью ради детей и не тащить мужа к психологам, а пробить стену глухоты со своей стороны через восстановление ресурса, снятие контроля и прямой диалог.</w:t>
+        <w:t>Разорвать замкнутый круг «нападение ➔ молчанка» ➔ научиться гасить ссору в первые 30 секунд (правило паузы 20 минут) ➔ снять груз старых обид ➔ вернуть в дом живой вечерний диалог, уважение и тактильное тепло.</w:t>
       </w:r>
     </w:p>
     <w:p>
       <w:pPr>
-        <w:spacing w:after="100" w:line="276" w:lineRule="auto"/>
+        <w:spacing w:after="80" w:line="276" w:lineRule="auto"/>
       </w:pPr>
       <w:r>
         <w:rPr>
           <w:rFonts w:ascii="Calibri" w:hAnsi="Calibri"/>
           <w:b/>
-          <w:color w:val="222222"/>
-          <w:sz w:val="22"/>
+          <w:sz w:val="20"/>
         </w:rPr>
-        <w:t xml:space="preserve">Методологическая база: </w:t>
+        <w:t xml:space="preserve">Оффер: </w:t>
       </w:r>
       <w:r>
         <w:rPr>
           <w:rFonts w:ascii="Calibri" w:hAnsi="Calibri"/>
           <w:i w:val="0"/>
-          <w:color w:val="333333"/>
-          <w:sz w:val="22"/>
+          <w:sz w:val="20"/>
         </w:rPr>
-        <w:t>Джон Готтман (Physiological Self-Soothing, 4 всадника, Flooding, Softened Startup, Bids for connection), СПА (Системно-поведенческий анализ), прикладные техники НЛП.</w:t>
+        <w:t>2 400 ₽ при быстрой оплате в течение 1 часа (базовая цена — 5 000 ₽).</w:t>
       </w:r>
     </w:p>
     <w:p>
       <w:pPr>
-        <w:spacing w:before="320" w:after="120"/>
+        <w:spacing w:before="240" w:after="60"/>
       </w:pPr>
       <w:r>
         <w:rPr>
           <w:rFonts w:ascii="Calibri" w:hAnsi="Calibri"/>
           <w:b/>
           <w:color w:val="1F4E5B"/>
-          <w:sz w:val="30"/>
+          <w:sz w:val="25"/>
         </w:rPr>
-        <w:t>2. УРОК 0 (ЛЕНДИНГ): «ПОЧЕМУ МЫ СТАЛИ ЧУЖИМИ ПОД ОДНОЙ КРЫШЕЙ»</w:t>
+        <w:t>УРОК 0: РАЗРЫВ ЗАМКНУТОГО КРУГА (ВВОДНЫЙ)</w:t>
       </w:r>
     </w:p>
     <w:p>
       <w:pPr>
-        <w:spacing w:after="100" w:line="276" w:lineRule="auto"/>
+        <w:spacing w:before="120" w:after="80"/>
+        <w:ind w:left="288"/>
       </w:pPr>
       <w:r>
         <w:rPr>
           <w:rFonts w:ascii="Calibri" w:hAnsi="Calibri"/>
           <w:b/>
-          <w:color w:val="222222"/>
-          <w:sz w:val="22"/>
+          <w:color w:val="C0392B"/>
+          <w:sz w:val="20"/>
         </w:rPr>
-        <w:t xml:space="preserve">Параметры: </w:t>
+        <w:t>🎬 РЕЖИССЁРСКАЯ КАРТА СПИКЕРА (КАК ВЕСТИ ЭТОТ УРОК ДЛЯ 100% ДОХОДИМОСТИ):</w:t>
+        <w:br/>
       </w:r>
       <w:r>
         <w:rPr>
           <w:rFonts w:ascii="Calibri" w:hAnsi="Calibri"/>
-          <w:i w:val="0"/>
-          <w:color w:val="333333"/>
-          <w:sz w:val="22"/>
+          <w:b/>
+          <w:sz w:val="19"/>
         </w:rPr>
-        <w:t>Экран 26 (out/client/26_landing_family.html) | Оффер: 2 400 ₽ (скидка на 1 час) / 5 000 ₽</w:t>
+        <w:t>• Роль спикера: Мудрый семейный медиатор / Старший наставник, знающий цену браку</w:t>
+        <w:br/>
       </w:r>
-    </w:p>
-    <w:tbl>
-      <w:tblPr>
-        <w:tblW w:type="auto" w:w="0"/>
-        <w:jc w:val="center"/>
-        <w:tblLook w:firstColumn="1" w:firstRow="1" w:lastColumn="0" w:lastRow="0" w:noHBand="0" w:noVBand="1" w:val="04A0"/>
-      </w:tblPr>
-      <w:tblGrid>
-        <w:gridCol w:w="9360"/>
-      </w:tblGrid>
-      <w:tr>
-        <w:tc>
-          <w:tcPr>
-            <w:tcW w:type="dxa" w:w="9360"/>
-            <w:shd w:val="clear" w:color="auto" w:fill="F3F6F5"/>
-          </w:tcPr>
-          <w:p>
-            <w:pPr>
-              <w:spacing w:before="120" w:after="40" w:line="276" w:lineRule="auto"/>
-            </w:pPr>
-            <w:r>
-              <w:rPr>
-                <w:rFonts w:ascii="Calibri" w:hAnsi="Calibri"/>
-                <w:b/>
-                <w:color w:val="1F4E5B"/>
-                <w:sz w:val="21"/>
-              </w:rPr>
-              <w:t>🎙 Текст для суфлёра (видео):</w:t>
-              <w:br/>
-            </w:r>
-            <w:r>
-              <w:rPr>
-                <w:rFonts w:ascii="Calibri" w:hAnsi="Calibri"/>
-                <w:i/>
-                <w:color w:val="243139"/>
-                <w:sz w:val="21"/>
-              </w:rPr>
-              <w:t xml:space="preserve">Здравствуйте, и давайте сразу к делу. </w:t>
-              <w:br/>
-              <w:br/>
-              <w:t xml:space="preserve">Это видео — для тех, кто уже давно в отношениях. Может быть, 7, 15, 20 или больше лет. </w:t>
-              <w:br/>
-              <w:br/>
-              <w:t xml:space="preserve">И скорее всего, вы оглядываетесь назад и понимаете интересную вещь: </w:t>
-              <w:br/>
-              <w:t xml:space="preserve">Вроде бы всё есть. Дом построен, быт налажен, дети растут, серьезных поводов для развода нет — никто не пьет, никто не дерется. </w:t>
-              <w:br/>
-              <w:t>А главного — того, ради чего вы когда-то соединялись — больше нет.</w:t>
-              <w:br/>
-              <w:br/>
-              <w:t xml:space="preserve">Вы соседи, живущие параллельными жизнями. </w:t>
-              <w:br/>
-              <w:t xml:space="preserve">Он на своей половине — со своими делами, работой, экранами или гаражом. Вы — на своей. </w:t>
-              <w:br/>
-              <w:t xml:space="preserve">Про секс вообще молчу: он стал редким и превратился в супружеский долг по расписанию, как платежи по ипотеке. </w:t>
-              <w:br/>
-              <w:t xml:space="preserve">Прикосновения и объятия без повода давно исчезли, а если они и случаются, то скорее раздражают. </w:t>
-              <w:br/>
-              <w:t>Вы ловите себя на мысли, что вам с посторонними людьми интереснее и проще поговорить, чем с собственным мужем.</w:t>
-              <w:br/>
-              <w:br/>
-              <w:t xml:space="preserve">И внутри поднимается простой вопрос: неужели это всё? </w:t>
-              <w:br/>
-              <w:t>Неужели любые долгие отношения обречены превращаться в унылое сосуществование двух уставших пенсионеров?</w:t>
-              <w:br/>
-              <w:br/>
-              <w:t xml:space="preserve">Многие ставят на себе крест и думают, что огонь и влечение уходят с годами сами по себе. </w:t>
-              <w:br/>
-              <w:t xml:space="preserve">Это миф. </w:t>
-              <w:br/>
-              <w:br/>
-              <w:t xml:space="preserve">Чужими людей делает не возраст и не стаж отношений. </w:t>
-              <w:br/>
-              <w:t xml:space="preserve">Чужими люди становятся от накапливающейся бытовой глухоты и невидимых обид, которые никто не проговаривает годами, чтобы «не устраивать скандал». </w:t>
-              <w:br/>
-              <w:t xml:space="preserve">В первые годы вы еще спорили, а потом просто устали что-либо доказывать. Вы заранее знаете все ответы, которые вам скажут. </w:t>
-              <w:br/>
-              <w:t>Вы копите эту тишину, закрываетесь броней — и между вами замерзает любое влечение.</w:t>
-              <w:br/>
-              <w:br/>
-              <w:t xml:space="preserve">Я предлагаю вам пройти небольшой курс. </w:t>
-              <w:br/>
-              <w:t>И сразу скажу, чего мы делать точно НЕ будем:</w:t>
-              <w:br/>
-              <w:t xml:space="preserve">Мы не будем «спасать семью ради детей». </w:t>
-              <w:br/>
-              <w:t xml:space="preserve">Мы не будем учить вас «быть покорной музой», надевать кружева и вдохновлять мужа борщами. </w:t>
-              <w:br/>
-              <w:t>И главное — вам не придется тащить мужа к психологу и уговаривать его измениться. Мужа мы вообще трогать не будем.</w:t>
-              <w:br/>
-              <w:br/>
-              <w:t>Мы начнем с вас и пошагово наведем порядок:</w:t>
-              <w:br/>
-              <w:t>— Сначала вернем вам личный запас сил и выдохнем, потому что из пустого кувшина никого нельзя напоить.</w:t>
-              <w:br/>
-              <w:t>— Поймем, где именно в вашей паре срабатывает тумблер глухоты, и научимся останавливать ссору в первые тридцать секунд.</w:t>
-              <w:br/>
-              <w:t>— Сбросим с вас тяжелую роль домашнего контролера, освободим ваши силы и вернем мужчине желание проявлять инициативу.</w:t>
-              <w:br/>
-              <w:t>— Освоим простую формулу прямого разговора: научимся говорить о своей усталости и желаниях так, чтобы вас слышали, а не уходили в оборону.</w:t>
-              <w:br/>
-              <w:t>— И зафиксируем новые правила совместной жизни с защитой от откатов, чтобы не сползать обратно в привычную тишину.</w:t>
-              <w:br/>
-              <w:br/>
-              <w:t xml:space="preserve">Внизу под видео я прикрепил первую короткую аудиопрактику на снятие вечернего напряжения — чтобы вы почувствовали свое тело и вернули контакт с собой. </w:t>
-              <w:br/>
-              <w:t>Включайте ее в наушниках — и начнем разбираться.</w:t>
-              <w:br/>
-              <w:br/>
-              <w:t xml:space="preserve">А для тех, кто готов идти в работу дальше — под видео есть кнопка курса. Специальная цена 2 400 рублей действует в течение часа. </w:t>
-              <w:br/>
-              <w:t>Жду вас на первом уроке.</w:t>
-            </w:r>
-          </w:p>
-        </w:tc>
-      </w:tr>
-    </w:tbl>
-    <w:p>
-      <w:pPr>
-        <w:spacing w:after="120"/>
-      </w:pPr>
+      <w:r>
+        <w:rPr>
+          <w:rFonts w:ascii="Calibri" w:hAnsi="Calibri"/>
+          <w:sz w:val="19"/>
+        </w:rPr>
+        <w:t>• Базовая эмоция: Теплое понимание, спокойное снятие вины, надежда без иллюзий</w:t>
+        <w:br/>
+      </w:r>
+      <w:r>
+        <w:rPr>
+          <w:rFonts w:ascii="Calibri" w:hAnsi="Calibri"/>
+          <w:b/>
+          <w:color w:val="1F4E5B"/>
+          <w:sz w:val="19"/>
+        </w:rPr>
+        <w:t>• Невербальное МЕТАСООБЩЕНИЕ: ««Ваша любовь не умерла, она просто задохнулась под слоем бытовой усталости. Вы воюете не друг с другом, а с дурацким шаблоном ссор. Я покажу, как сломать этот шаблон уже сегодня вечером».»</w:t>
+        <w:br/>
+      </w:r>
+      <w:r>
+        <w:rPr>
+          <w:rFonts w:ascii="Calibri" w:hAnsi="Calibri"/>
+          <w:sz w:val="19"/>
+        </w:rPr>
+        <w:t>• Голос, темп и тело: Мягкий, глубокий, бархатный баритон. Чуть замедленный доверительный темп. Взгляд сочувствующий и уверенный. Никакого нравоучения — разговор двух взрослых людей на кухне за чаем.</w:t>
+        <w:br/>
+      </w:r>
+      <w:r>
+        <w:rPr>
+          <w:rFonts w:ascii="Calibri" w:hAnsi="Calibri"/>
+          <w:i/>
+          <w:sz w:val="19"/>
+        </w:rPr>
+        <w:t>• Почему зритель досмотрит до конца: Зритель мгновенно узнает свою семью в деталях («соседи по квартире», «секс по праздникам») и понимает, что его не будут судить или заставлять ломать себя.</w:t>
+      </w:r>
     </w:p>
     <w:p>
       <w:pPr>
-        <w:spacing w:after="100" w:line="276" w:lineRule="auto"/>
+        <w:spacing w:before="160" w:after="40"/>
       </w:pPr>
       <w:r>
         <w:rPr>
           <w:rFonts w:ascii="Calibri" w:hAnsi="Calibri"/>
           <w:b/>
-          <w:color w:val="222222"/>
+          <w:color w:val="0E6E5D"/>
           <w:sz w:val="22"/>
         </w:rPr>
-        <w:t xml:space="preserve">Вводная аудиопрактика: </w:t>
-      </w:r>
-      <w:r>
-        <w:rPr>
-          <w:rFonts w:ascii="Calibri" w:hAnsi="Calibri"/>
-          <w:i w:val="0"/>
-          <w:color w:val="333333"/>
-          <w:sz w:val="22"/>
-        </w:rPr>
-        <w:t>«Штиль в теле: возвращение к себе и контакт с телом» (10 минут). Соматическое заземление, снятие спазма с шеи и челюстей.</w:t>
+        <w:t>1. ТЕКСТ СУФЛЁРА ДЛЯ ВИДЕО АНАТОЛИЯ ФЁДОРОВА (3.5 МИН)</w:t>
       </w:r>
     </w:p>
     <w:p>
       <w:pPr>
-        <w:spacing w:before="320" w:after="120"/>
+        <w:spacing w:after="80" w:line="276" w:lineRule="auto"/>
+      </w:pPr>
+      <w:r>
+        <w:rPr>
+          <w:rFonts w:ascii="Calibri" w:hAnsi="Calibri"/>
+          <w:i/>
+          <w:sz w:val="20"/>
+        </w:rPr>
+        <w:t>«Здравствуйте. С вами Анатолий Фёдоров.</w:t>
+        <w:br/>
+        <w:br/>
+        <w:t>Если вы сейчас здесь, значит, в вашей семье происходит то, с чем сталкиваются почти все пары со стажем от семи лет и больше.</w:t>
+        <w:br/>
+        <w:br/>
+        <w:t>Вроде бы всё есть: дом, дети, налаженный быт, привычный уклад. Но куда-то ушло самое главное — живое тепло, нежность и интерес друг к другу. Отношения незаметно превратились в «родительско-бытовой кооператив». Вы живете как соседи в параллельных комнатах: дежурные фразы «Купи хлеба», «Кто заберет детей?», телефоны по вечерам и секс по праздникам.</w:t>
+        <w:br/>
+        <w:br/>
+        <w:t>А любая мелочь — не так поставленная чашка или забытая просьба — мгновенно вспыхивает ссорой. И дальше начинается знакомый сценарий: один нападает с претензиями, второй закрывается, уходит в молчанку или хлопает дверью. И дом погружается в ледяную тишину на несколько дней.</w:t>
+        <w:br/>
+        <w:br/>
+        <w:t>Я скажу вам главное: ваша любовь не умерла. Она просто погребена под слоем накопленной усталости и обид. Вы воюете не друг с другом — вы воюете с привычным негативным циклом.</w:t>
+        <w:br/>
+        <w:br/>
+        <w:t>Наш курс «Мы вместе» — это простая пошаговая перезагрузка вашего союза. Мы не будем копаться в детских травмах годами. Мы возьмем работающие методы профессора Джона Готтмана и системной семейной терапии:</w:t>
+        <w:br/>
+        <w:t>1. Научимся останавливать любую ссору в первые тридцать секунд, пока пульс не улетел в космос.</w:t>
+        <w:br/>
+        <w:t>2. Снимем груз глухих обид через соматическую практику «Штиль в теле».</w:t>
+        <w:br/>
+        <w:t>3. Перейдем от взаимных упреков к прямому и безопасному разговору.</w:t>
+        <w:br/>
+        <w:br/>
+        <w:t>Под этим видео вас ждет специальное предложение на полный курс. Нажимайте кнопку, и мы начинаем первый урок.»</w:t>
+      </w:r>
+    </w:p>
+    <w:p>
+      <w:pPr>
+        <w:spacing w:before="240" w:after="60"/>
       </w:pPr>
       <w:r>
         <w:rPr>
           <w:rFonts w:ascii="Calibri" w:hAnsi="Calibri"/>
           <w:b/>
           <w:color w:val="1F4E5B"/>
-          <w:sz w:val="30"/>
+          <w:sz w:val="25"/>
         </w:rPr>
-        <w:t>3. УРОК 1: «ГДЕ ВАШИ БАТАРЕЙКИ: ВОЗВРАТ РЕСУРСА»</w:t>
+        <w:t>УРОК 1: ТАНЕЦ ССОРЫ: НАПАДАЮЩИЙ И УБЕГАЮЩИЙ</w:t>
       </w:r>
     </w:p>
     <w:p>
       <w:pPr>
-        <w:spacing w:after="100" w:line="276" w:lineRule="auto"/>
+        <w:spacing w:before="120" w:after="80"/>
+        <w:ind w:left="288"/>
       </w:pPr>
       <w:r>
         <w:rPr>
           <w:rFonts w:ascii="Calibri" w:hAnsi="Calibri"/>
           <w:b/>
-          <w:color w:val="222222"/>
-          <w:sz w:val="22"/>
+          <w:color w:val="C0392B"/>
+          <w:sz w:val="20"/>
         </w:rPr>
-        <w:t xml:space="preserve">Параметры: </w:t>
+        <w:t>🎬 РЕЖИССЁРСКАЯ КАРТА СПИКЕРА (КАК ВЕСТИ ЭТОТ УРОК ДЛЯ 100% ДОХОДИМОСТИ):</w:t>
+        <w:br/>
       </w:r>
       <w:r>
         <w:rPr>
           <w:rFonts w:ascii="Calibri" w:hAnsi="Calibri"/>
-          <w:i w:val="0"/>
-          <w:color w:val="333333"/>
-          <w:sz w:val="22"/>
+          <w:b/>
+          <w:sz w:val="19"/>
         </w:rPr>
-        <w:t>Экран 27 (out/client/27_lesson1.html) | Фаза Готтмана: Physiological Self-Soothing</w:t>
+        <w:t>• Роль спикера: Зоркий исследователь семейных систем / Декодер скрытых сигналов</w:t>
+        <w:br/>
       </w:r>
-    </w:p>
-    <w:tbl>
-      <w:tblPr>
-        <w:tblW w:type="auto" w:w="0"/>
-        <w:jc w:val="center"/>
-        <w:tblLook w:firstColumn="1" w:firstRow="1" w:lastColumn="0" w:lastRow="0" w:noHBand="0" w:noVBand="1" w:val="04A0"/>
-      </w:tblPr>
-      <w:tblGrid>
-        <w:gridCol w:w="9360"/>
-      </w:tblGrid>
-      <w:tr>
-        <w:tc>
-          <w:tcPr>
-            <w:tcW w:type="dxa" w:w="9360"/>
-            <w:shd w:val="clear" w:color="auto" w:fill="F3F6F5"/>
-          </w:tcPr>
-          <w:p>
-            <w:pPr>
-              <w:spacing w:before="120" w:after="40" w:line="276" w:lineRule="auto"/>
-            </w:pPr>
-            <w:r>
-              <w:rPr>
-                <w:rFonts w:ascii="Calibri" w:hAnsi="Calibri"/>
-                <w:b/>
-                <w:color w:val="1F4E5B"/>
-                <w:sz w:val="21"/>
-              </w:rPr>
-              <w:t>🎙 Текст для суфлёра (видео):</w:t>
-              <w:br/>
-            </w:r>
-            <w:r>
-              <w:rPr>
-                <w:rFonts w:ascii="Calibri" w:hAnsi="Calibri"/>
-                <w:i/>
-                <w:color w:val="243139"/>
-                <w:sz w:val="21"/>
-              </w:rPr>
-              <w:t xml:space="preserve">Если вы сегодня заходите домой с гудящей головой, а внутри звенит мысль «как же я от всего устала» — остановитесь. </w:t>
-              <w:br/>
-              <w:br/>
-              <w:t xml:space="preserve">Мы не начнем этот курс с разговоров о вашем муже. </w:t>
-              <w:br/>
-              <w:t xml:space="preserve">И мы не полезем сегодня разбирать ваши ссоры. </w:t>
-              <w:br/>
-              <w:br/>
-              <w:t xml:space="preserve">Потому что если человек находится на нулевой батарейке — любые попытки что-то «налаживать в семье» гарантированно закончатся новым скандалом или еще большим бессилием. </w:t>
-              <w:br/>
-              <w:t>Нельзя накормить семью из абсолютно пустого холодильника.</w:t>
-              <w:br/>
-              <w:br/>
-              <w:t xml:space="preserve">Вспомните, как вы обычно приходите к вечеру: </w:t>
-              <w:br/>
-              <w:t xml:space="preserve">Ноги гудят, шея зажата, в голове крутится список из двадцати несделанных дел. </w:t>
-              <w:br/>
-              <w:t xml:space="preserve">Вы открываете дверь — а там муж лежит на диване в телефоне или на кухне стоит немытая чашка. </w:t>
-              <w:br/>
-              <w:t xml:space="preserve">И вас взрывает не сама эта посуда. </w:t>
-              <w:br/>
-              <w:t>Вас взрывает то, что у вас внутри нет ни капли запаса прочности. Любая мелочь пробивает брешь.</w:t>
-              <w:br/>
-              <w:br/>
-              <w:t xml:space="preserve">Вы годами отдавали все силы наружу: детям, мужу, быту, родителям, работе. </w:t>
-              <w:br/>
-              <w:t>А себе оставляли крошки — бессмысленное залипание в экране на ночь, от которого голова раскалывается еще сильнее.</w:t>
-              <w:br/>
-              <w:br/>
-              <w:t xml:space="preserve">Поэтому первый шаг — это не разборки. </w:t>
-              <w:br/>
-              <w:t>Первый шаг — это вернуть вам хотя бы двадцать процентов личной энергии и право на нормальный выдох.</w:t>
-              <w:br/>
-              <w:br/>
-              <w:t xml:space="preserve">Прямо сейчас спуститесь под это видео. </w:t>
-              <w:br/>
-              <w:t xml:space="preserve">Там лежит минутный чек-лист утечек ваших сил и короткая аудиопрактика на снятие вечернего напряжения. </w:t>
-              <w:br/>
-              <w:br/>
-              <w:t xml:space="preserve">Наденьте наушники, закройте дверь в комнату и дайте себе пятнадцать минут законной тишины. Без домашних подвигов и без чувства вины. </w:t>
-              <w:br/>
-              <w:br/>
-              <w:t>Сначала вернем вам дыхание — а уже завтра разберем, почему ваши ссоры вспыхивают за три секунды и как этот тумблер выключить.</w:t>
-            </w:r>
-          </w:p>
-        </w:tc>
-      </w:tr>
-    </w:tbl>
-    <w:p>
-      <w:pPr>
-        <w:spacing w:after="120"/>
-      </w:pPr>
+      <w:r>
+        <w:rPr>
+          <w:rFonts w:ascii="Calibri" w:hAnsi="Calibri"/>
+          <w:sz w:val="19"/>
+        </w:rPr>
+        <w:t>• Базовая эмоция: Азарт исследователя, открытие глаз, облегчение («эврика!»)</w:t>
+        <w:br/>
+      </w:r>
+      <w:r>
+        <w:rPr>
+          <w:rFonts w:ascii="Calibri" w:hAnsi="Calibri"/>
+          <w:b/>
+          <w:color w:val="1F4E5B"/>
+          <w:sz w:val="19"/>
+        </w:rPr>
+        <w:t>• Невербальное МЕТАСООБЩЕНИЕ: ««Посмотри на вашу ссору со стороны. Претензия — это крик о близости, а молчание — попытка защититься от боли. Никто из вас не монстр. Вы оба просто защищаетесь».»</w:t>
+        <w:br/>
+      </w:r>
+      <w:r>
+        <w:rPr>
+          <w:rFonts w:ascii="Calibri" w:hAnsi="Calibri"/>
+          <w:sz w:val="19"/>
+        </w:rPr>
+        <w:t>• Голос, темп и тело: Энергичный, живой, увлекательный тон. Анатолий рисует руками схему цикла («нападение ➔ побег»). Голос звучит с легкой доброжелательной иронией над семейными клише.</w:t>
+        <w:br/>
+      </w:r>
+      <w:r>
+        <w:rPr>
+          <w:rFonts w:ascii="Calibri" w:hAnsi="Calibri"/>
+          <w:i/>
+          <w:sz w:val="19"/>
+        </w:rPr>
+        <w:t>• Почему зритель досмотрит до конца: У зрителя спадает пелена злости на партнера. Он впервые видит истинную причину ссор и хочет узнать, как это остановить.</w:t>
+      </w:r>
     </w:p>
     <w:p>
       <w:pPr>
-        <w:spacing w:after="100" w:line="276" w:lineRule="auto"/>
+        <w:spacing w:before="160" w:after="40"/>
       </w:pPr>
       <w:r>
         <w:rPr>
           <w:rFonts w:ascii="Calibri" w:hAnsi="Calibri"/>
           <w:b/>
-          <w:color w:val="222222"/>
+          <w:color w:val="0E6E5D"/>
           <w:sz w:val="22"/>
         </w:rPr>
-        <w:t xml:space="preserve">Интерактив: </w:t>
-      </w:r>
-      <w:r>
-        <w:rPr>
-          <w:rFonts w:ascii="Calibri" w:hAnsi="Calibri"/>
-          <w:i w:val="0"/>
-          <w:color w:val="333333"/>
-          <w:sz w:val="22"/>
-        </w:rPr>
-        <w:t>Чек-лист «Где сегодня потерялись силы?» (30 секунд, мультиселект) + Подсказка виртуального попутчика Анатолия.</w:t>
+        <w:t>1. ТЕКСТ СУФЛЁРА ДЛЯ ВИДЕО АНАТОЛИЯ ФЁДОРОВА (4 МИН)</w:t>
       </w:r>
     </w:p>
     <w:p>
       <w:pPr>
-        <w:spacing w:after="100" w:line="276" w:lineRule="auto"/>
+        <w:spacing w:after="80" w:line="276" w:lineRule="auto"/>
       </w:pPr>
       <w:r>
         <w:rPr>
           <w:rFonts w:ascii="Calibri" w:hAnsi="Calibri"/>
-          <w:b/>
-          <w:color w:val="222222"/>
-          <w:sz w:val="22"/>
+          <w:i/>
+          <w:sz w:val="20"/>
         </w:rPr>
-        <w:t xml:space="preserve">Аудиопрактика 1: </w:t>
-      </w:r>
-      <w:r>
-        <w:rPr>
-          <w:rFonts w:ascii="Calibri" w:hAnsi="Calibri"/>
-          <w:i w:val="0"/>
-          <w:color w:val="333333"/>
-          <w:sz w:val="22"/>
-        </w:rPr>
-        <w:t>«Штиль в теле: сброс вечернего перегруза» (12 минут). Снятие мышечного панциря с шеи, челюстей и грудины.</w:t>
+        <w:t>«Здравствуйте. С вами Анатолий Фёдоров. Сегодня мы разберем главный сценарий, который разрушает 9 из 10 браков со стажем. Это замкнутый цикл «Нападающий — Убегающий».</w:t>
+        <w:br/>
+        <w:br/>
+        <w:t>Как это выглядит в жизни?</w:t>
+        <w:br/>
+        <w:t>Один партнер (часто женщина, но бывает и мужчина) чувствует одиночество и пытается достучаться. Но делает это через упрек: «Ты вечно в телефоне! Тебе на нас плевать!». А второй партнер воспринимает упрек как нападение. Его мозг включает защиту: замкнуться, уткнуться в экран, уйти в гараж или включить глухую молчанку.</w:t>
+        <w:br/>
+        <w:br/>
+        <w:t>Первый видит молчание и распаляется еще сильнее: «Ты меня игнорируешь!». А второй закрывается еще глубже. Цикл замкнулся.</w:t>
+        <w:br/>
+        <w:br/>
+        <w:t>В чем парадокс?</w:t>
+        <w:br/>
+        <w:t>— Претензия — это не злость. Это неумелый, отчаянный крик: «Заметь меня! Мне тебя не хватает!».</w:t>
+        <w:br/>
+        <w:t>— А молчание и уход в телефон — это не равнодушие. Это попытка спрятаться от болезненного удара.</w:t>
+        <w:br/>
+        <w:br/>
+        <w:t>Вы оба хотите одного и того же — безопасности и покоя. Но пользуетесь инструментами, которые уничтожают контакт.</w:t>
+        <w:br/>
+        <w:br/>
+        <w:t>Под видео пройдите тест-тренажер «Определи свою роль в цикле ссор» и скачайте схему выхода из автоматической реакции. Сделайте это прямо сейчас и переходите ко 2 уроку.»</w:t>
       </w:r>
     </w:p>
     <w:p>
       <w:pPr>
-        <w:spacing w:before="320" w:after="120"/>
+        <w:spacing w:before="240" w:after="60"/>
       </w:pPr>
       <w:r>
         <w:rPr>
           <w:rFonts w:ascii="Calibri" w:hAnsi="Calibri"/>
           <w:b/>
           <w:color w:val="1F4E5B"/>
-          <w:sz w:val="30"/>
+          <w:sz w:val="25"/>
         </w:rPr>
-        <w:t>4. УРОК 2: «АНАТОМИЯ ССОРЫ: ГДЕ СРАБАТЫВАЕТ ТУМБЛЕР ГЛУХОТЫ»</w:t>
+        <w:t>УРОК 2: ПРАВИЛО 20 МИНУТ: КАК ОСТАНОВИТЬ ССОРУ В ПЕРВЫЕ 30 СЕКУНД</w:t>
       </w:r>
     </w:p>
     <w:p>
       <w:pPr>
-        <w:spacing w:after="100" w:line="276" w:lineRule="auto"/>
+        <w:spacing w:before="120" w:after="80"/>
+        <w:ind w:left="288"/>
       </w:pPr>
       <w:r>
         <w:rPr>
           <w:rFonts w:ascii="Calibri" w:hAnsi="Calibri"/>
           <w:b/>
-          <w:color w:val="222222"/>
-          <w:sz w:val="22"/>
+          <w:color w:val="C0392B"/>
+          <w:sz w:val="20"/>
         </w:rPr>
-        <w:t xml:space="preserve">Параметры: </w:t>
+        <w:t>🎬 РЕЖИССЁРСКАЯ КАРТА СПИКЕРА (КАК ВЕСТИ ЭТОТ УРОК ДЛЯ 100% ДОХОДИМОСТИ):</w:t>
+        <w:br/>
       </w:r>
       <w:r>
         <w:rPr>
           <w:rFonts w:ascii="Calibri" w:hAnsi="Calibri"/>
-          <w:i w:val="0"/>
-          <w:color w:val="333333"/>
-          <w:sz w:val="22"/>
+          <w:b/>
+          <w:sz w:val="19"/>
         </w:rPr>
-        <w:t>Экран 28 (out/client/28_lesson2.html) | Научная база: Готтман (Flooding, пульс &gt;100, правило 20 минут)</w:t>
+        <w:t>• Роль спикера: Спортивный врач / Физиолог высокой эффективности</w:t>
+        <w:br/>
       </w:r>
-    </w:p>
-    <w:tbl>
-      <w:tblPr>
-        <w:tblW w:type="auto" w:w="0"/>
-        <w:jc w:val="center"/>
-        <w:tblLook w:firstColumn="1" w:firstRow="1" w:lastColumn="0" w:lastRow="0" w:noHBand="0" w:noVBand="1" w:val="04A0"/>
-      </w:tblPr>
-      <w:tblGrid>
-        <w:gridCol w:w="9360"/>
-      </w:tblGrid>
-      <w:tr>
-        <w:tc>
-          <w:tcPr>
-            <w:tcW w:type="dxa" w:w="9360"/>
-            <w:shd w:val="clear" w:color="auto" w:fill="F3F6F5"/>
-          </w:tcPr>
-          <w:p>
-            <w:pPr>
-              <w:spacing w:before="120" w:after="40" w:line="276" w:lineRule="auto"/>
-            </w:pPr>
-            <w:r>
-              <w:rPr>
-                <w:rFonts w:ascii="Calibri" w:hAnsi="Calibri"/>
-                <w:b/>
-                <w:color w:val="1F4E5B"/>
-                <w:sz w:val="21"/>
-              </w:rPr>
-              <w:t>🎙 Текст для суфлёра (видео):</w:t>
-              <w:br/>
-            </w:r>
-            <w:r>
-              <w:rPr>
-                <w:rFonts w:ascii="Calibri" w:hAnsi="Calibri"/>
-                <w:i/>
-                <w:color w:val="243139"/>
-                <w:sz w:val="21"/>
-              </w:rPr>
-              <w:t xml:space="preserve">Здравствуйте. Это второй урок. </w:t>
-              <w:br/>
-              <w:t>Сегодня мы разберем, как устроена типичная ссора в паре, которая живет вместе много лет.</w:t>
-              <w:br/>
-              <w:br/>
-              <w:t xml:space="preserve">Вспомните: скандал вспыхивает буквально за полминуты от ерунды. </w:t>
-              <w:br/>
-              <w:t xml:space="preserve">Не так посмотрел, тяжело вздохнул на кухне, не помыл чашку, ответил с раздражением. </w:t>
-              <w:br/>
-              <w:br/>
-              <w:t xml:space="preserve">Вы делаете замечание. Он либо огрызается, либо надевает каменное лицо, замолкает и уходит — в комнату, в телефон или в гараж. </w:t>
-              <w:br/>
-              <w:t xml:space="preserve">Вас это взрывает: «С тобой невозможно разговаривать!». </w:t>
-              <w:br/>
-              <w:t xml:space="preserve">А он делает звук телевизора громче или надевает наушники. </w:t>
-              <w:br/>
-              <w:t>Итог — в квартире на три дня повисает ледяная тишина.</w:t>
-              <w:br/>
-              <w:br/>
-              <w:t xml:space="preserve">Вам кажется: «Ему плевать, он меня не уважает». </w:t>
-              <w:br/>
-              <w:t xml:space="preserve">Но ученые в лаборатории Джона Готтмана замерили пульс мужчин в момент таких стычек: он подскакивает выше 100 ударов в минуту. </w:t>
-              <w:br/>
-              <w:t xml:space="preserve">Организм испытывает перегруз и воспринимает упрек как угрозу. Мужской мозг включает аварийный тормоз — глухую оборону. </w:t>
-              <w:br/>
-              <w:t xml:space="preserve">Его молчание — это не наглость. Это попытка не сорваться и спастись от перегруза. </w:t>
-              <w:br/>
-              <w:br/>
-              <w:t>А вы считываете это молчание как отвержение и нападаете еще сильнее. Получается замкнутый круг.</w:t>
-              <w:br/>
-              <w:br/>
-              <w:t>И главное правило Готтмана: если вы видите каменное лицо или чувствуете, что внутри закипает — бесполезно достучаться. Нужно взять паузу ровно на 20 минут. Физически разойтись в разные комнаты и дать пульсу остыть.</w:t>
-              <w:br/>
-              <w:br/>
-              <w:t xml:space="preserve">Внизу под видео вас ждет простая карточка из трех вопросов. </w:t>
-              <w:br/>
-              <w:t xml:space="preserve">Она поможет за одну минуту увидеть, с какой фразы начинается ваша ссора и как выключать этот тумблер. </w:t>
-              <w:br/>
-              <w:t>Спуститесь вниз и заполните ее.</w:t>
-            </w:r>
-          </w:p>
-        </w:tc>
-      </w:tr>
-    </w:tbl>
-    <w:p>
-      <w:pPr>
-        <w:spacing w:after="120"/>
-      </w:pPr>
+      <w:r>
+        <w:rPr>
+          <w:rFonts w:ascii="Calibri" w:hAnsi="Calibri"/>
+          <w:sz w:val="19"/>
+        </w:rPr>
+        <w:t>• Базовая эмоция: Практическая точность, наглядность, спортивный азарт внедрения</w:t>
+        <w:br/>
+      </w:r>
+      <w:r>
+        <w:rPr>
+          <w:rFonts w:ascii="Calibri" w:hAnsi="Calibri"/>
+          <w:b/>
+          <w:color w:val="1F4E5B"/>
+          <w:sz w:val="19"/>
+        </w:rPr>
+        <w:t>• Невербальное МЕТАСООБЩЕНИЕ: ««Когда пульс выше 100 ударов — вы биологически не способны слышать друг друга. Бесполезно спорить с телом. Возьмите тайм-аут на 20 минут, охладите кровь, и ссора умрет сама собой».»</w:t>
+        <w:br/>
+      </w:r>
+      <w:r>
+        <w:rPr>
+          <w:rFonts w:ascii="Calibri" w:hAnsi="Calibri"/>
+          <w:sz w:val="19"/>
+        </w:rPr>
+        <w:t>• Голос, темп и тело: Четкий, прикладной, бодрый темп. Анатолий показывает на запястье пульс, жестикулирует уверенно и конкретно.</w:t>
+        <w:br/>
+      </w:r>
+      <w:r>
+        <w:rPr>
+          <w:rFonts w:ascii="Calibri" w:hAnsi="Calibri"/>
+          <w:i/>
+          <w:sz w:val="19"/>
+        </w:rPr>
+        <w:t>• Почему зритель досмотрит до конца: Зритель получает железобетонный инструмент, который можно применить буквально сегодня за ужином.</w:t>
+      </w:r>
     </w:p>
     <w:p>
       <w:pPr>
-        <w:spacing w:after="100" w:line="276" w:lineRule="auto"/>
+        <w:spacing w:before="160" w:after="40"/>
       </w:pPr>
       <w:r>
         <w:rPr>
           <w:rFonts w:ascii="Calibri" w:hAnsi="Calibri"/>
           <w:b/>
-          <w:color w:val="222222"/>
+          <w:color w:val="0E6E5D"/>
           <w:sz w:val="22"/>
         </w:rPr>
-        <w:t xml:space="preserve">Интерактив: </w:t>
-      </w:r>
-      <w:r>
-        <w:rPr>
-          <w:rFonts w:ascii="Calibri" w:hAnsi="Calibri"/>
-          <w:i w:val="0"/>
-          <w:color w:val="333333"/>
-          <w:sz w:val="22"/>
-        </w:rPr>
-        <w:t>«Карта тумблера ссоры» (3 вопроса за 1 минуту: триггер ➔ реакция мужа ➔ моя реакция) + Автоматическое правило 20 минут от попутчика.</w:t>
+        <w:t>1. ТЕКСТ СУФЛЁРА ДЛЯ ВИДЕО АНАТОЛИЯ ФЁДОРОВА (4.5 МИН)</w:t>
       </w:r>
     </w:p>
     <w:p>
       <w:pPr>
-        <w:spacing w:before="320" w:after="120"/>
+        <w:spacing w:after="80" w:line="276" w:lineRule="auto"/>
+      </w:pPr>
+      <w:r>
+        <w:rPr>
+          <w:rFonts w:ascii="Calibri" w:hAnsi="Calibri"/>
+          <w:i/>
+          <w:sz w:val="20"/>
+        </w:rPr>
+        <w:t>«Здравствуйте. С вами Анатолий Фёдоров. Сегодня — главное клиническое открытие профессора Джона Готтмана, которое спасло десятки тысяч семей.</w:t>
+        <w:br/>
+        <w:br/>
+        <w:t>Почему во время ссоры люди начинают кричать, говорить гадости и перестают слышать любые разумные аргументы?</w:t>
+        <w:br/>
+        <w:br/>
+        <w:t>Ответ в физиологии: когда начинается конфликт, сердце выбрасывает адреналин. Как только пульс превышает 100 ударов в минуту — мозг входит в состояние диффузного физиологического затопления (Flooding). В этот момент префронтальная кора отключается. Вы физиологически не можете сострадать и рассуждать логически. Вы можете только нападать или бежать.</w:t>
+        <w:br/>
+        <w:br/>
+        <w:t>И продолжать разговор в этом состоянии — чистое безумие. Каждое слово будет ядом.</w:t>
+        <w:br/>
+        <w:br/>
+        <w:t>Вот пошаговый протокол Готтмана:</w:t>
+        <w:br/>
+        <w:t>1. Сигнал «Тайм-аут»: Как только вы чувствуете, что голос поднимается, а в груди закипает — подайте условный знак: «Я чувствую, что мы закипаем. Мне нужна пауза на 20 минут».</w:t>
+        <w:br/>
+        <w:t>2. Ровно 20 минут физического разделения комнат. Это минимальное время, за которое печень расщепляет гормоны стресса.</w:t>
+        <w:br/>
+        <w:t>3. Строгое табу во время паузы: категорически запрещено прокручивать в голове диалоги обиды! Нужно переключить внимание на тело: умыться холодной водой, сделать медленный выдох или включить соматическую аудиопрактику.</w:t>
+        <w:br/>
+        <w:br/>
+        <w:t>Под видео вас ждет аудиосессия «Штиль в теле: сброс вечернего напряжения» (12 мин). Прослушайте ее и переходите к Уроку 3.»</w:t>
+      </w:r>
+    </w:p>
+    <w:p>
+      <w:pPr>
+        <w:spacing w:before="240" w:after="60"/>
       </w:pPr>
       <w:r>
         <w:rPr>
           <w:rFonts w:ascii="Calibri" w:hAnsi="Calibri"/>
           <w:b/>
           <w:color w:val="1F4E5B"/>
-          <w:sz w:val="30"/>
+          <w:sz w:val="25"/>
         </w:rPr>
-        <w:t>5. УРОК 3: «СБРОС РОЛИ МАМОЧКИ: КАК ВЕРНУТЬ МУЖСКУЮ ИНИЦИАТИВУ»</w:t>
+        <w:t>УРОК 3: АМНИСТИЯ ОБИД: КАК ОСТАВИТЬ ПРОШЛОЕ ЗА ПОРОГОМ</w:t>
       </w:r>
     </w:p>
     <w:p>
       <w:pPr>
-        <w:spacing w:after="100" w:line="276" w:lineRule="auto"/>
+        <w:spacing w:before="120" w:after="80"/>
+        <w:ind w:left="288"/>
       </w:pPr>
       <w:r>
         <w:rPr>
           <w:rFonts w:ascii="Calibri" w:hAnsi="Calibri"/>
           <w:b/>
-          <w:color w:val="222222"/>
-          <w:sz w:val="22"/>
+          <w:color w:val="C0392B"/>
+          <w:sz w:val="20"/>
         </w:rPr>
-        <w:t xml:space="preserve">Параметры: </w:t>
+        <w:t>🎬 РЕЖИССЁРСКАЯ КАРТА СПИКЕРА (КАК ВЕСТИ ЭТОТ УРОК ДЛЯ 100% ДОХОДИМОСТИ):</w:t>
+        <w:br/>
       </w:r>
       <w:r>
         <w:rPr>
           <w:rFonts w:ascii="Calibri" w:hAnsi="Calibri"/>
-          <w:i w:val="0"/>
-          <w:color w:val="333333"/>
-          <w:sz w:val="22"/>
+          <w:b/>
+          <w:sz w:val="19"/>
         </w:rPr>
-        <w:t>Экран 29 (out/client/29_lesson3.html) | Научная база: Готтман (Accepting Influence) + СПА</w:t>
+        <w:t>• Роль спикера: Глубокий психотерапевт-гипнолог / Хранитель душевного мира</w:t>
+        <w:br/>
       </w:r>
-    </w:p>
-    <w:tbl>
-      <w:tblPr>
-        <w:tblW w:type="auto" w:w="0"/>
-        <w:jc w:val="center"/>
-        <w:tblLook w:firstColumn="1" w:firstRow="1" w:lastColumn="0" w:lastRow="0" w:noHBand="0" w:noVBand="1" w:val="04A0"/>
-      </w:tblPr>
-      <w:tblGrid>
-        <w:gridCol w:w="9360"/>
-      </w:tblGrid>
-      <w:tr>
-        <w:tc>
-          <w:tcPr>
-            <w:tcW w:type="dxa" w:w="9360"/>
-            <w:shd w:val="clear" w:color="auto" w:fill="F3F6F5"/>
-          </w:tcPr>
-          <w:p>
-            <w:pPr>
-              <w:spacing w:before="120" w:after="40" w:line="276" w:lineRule="auto"/>
-            </w:pPr>
-            <w:r>
-              <w:rPr>
-                <w:rFonts w:ascii="Calibri" w:hAnsi="Calibri"/>
-                <w:b/>
-                <w:color w:val="1F4E5B"/>
-                <w:sz w:val="21"/>
-              </w:rPr>
-              <w:t>🎙 Текст для суфлёра (видео):</w:t>
-              <w:br/>
-            </w:r>
-            <w:r>
-              <w:rPr>
-                <w:rFonts w:ascii="Calibri" w:hAnsi="Calibri"/>
-                <w:i/>
-                <w:color w:val="243139"/>
-                <w:sz w:val="21"/>
-              </w:rPr>
-              <w:t xml:space="preserve">Здравствуйте. Это третий урок. </w:t>
-              <w:br/>
-              <w:t>Давайте поговорим о роли, в которую незаметно попадают почти все замужние женщины со стажем — роли «Мамочки».</w:t>
-              <w:br/>
-              <w:br/>
-              <w:t xml:space="preserve">Вы выходили замуж за взрослого мужчину. </w:t>
-              <w:br/>
-              <w:t>Но со временем взяли на себя руль: стали напоминать принять таблетки, проверять, что надел, советовать, как говорить с родственниками, и указывать, куда положить вещи.</w:t>
-              <w:br/>
-              <w:br/>
-              <w:t>Вам кажется, что это забота: «Если я не проконтролирую — всё пойдет наперекосяк!».</w:t>
-              <w:br/>
-              <w:br/>
-              <w:t>Но вот закон семейной психологии:</w:t>
-              <w:br/>
-              <w:t xml:space="preserve">С «мамами» не спят. От контролирующих мам мужчины защищаются пассивным саботажем. </w:t>
-              <w:br/>
-              <w:t>Когда вы встаете в позицию строгой родительницы, мужчина неизбежно превращается в сопротивляющегося подростка. Он ложится на диван, уходит в экраны или делает назло, чтобы отстоять хоть каплю свободы.</w:t>
-              <w:br/>
-              <w:br/>
-              <w:t xml:space="preserve">А внутри вас живет скрытый страх: «Если я отпущу контроль — я окажусь ненужной, а мир рухнет». </w:t>
-              <w:br/>
-              <w:br/>
-              <w:t>Пока вы держите руки на его территории — у мужчины нет шанса проявить инициативу. Он начинает действовать только тогда, когда сам несет ответственность за последствия своих решений.</w:t>
-              <w:br/>
-              <w:br/>
-              <w:t xml:space="preserve">Сегодня мы снимем с вас этот надзор. </w:t>
-              <w:br/>
-              <w:t xml:space="preserve">Внизу под видео выберите ровно одну сферу мужа, которую вы с сегодняшнего дня перестаете контролировать, и попутчик поможет составить простую фразу передачи дел без сарказма. </w:t>
-              <w:br/>
-              <w:t>Спуститесь вниз.</w:t>
-            </w:r>
-          </w:p>
-        </w:tc>
-      </w:tr>
-    </w:tbl>
-    <w:p>
-      <w:pPr>
-        <w:spacing w:after="120"/>
-      </w:pPr>
+      <w:r>
+        <w:rPr>
+          <w:rFonts w:ascii="Calibri" w:hAnsi="Calibri"/>
+          <w:sz w:val="19"/>
+        </w:rPr>
+        <w:t>• Базовая эмоция: Глубокое очищение, освобождение от тяжести, теплое милосердие</w:t>
+        <w:br/>
+      </w:r>
+      <w:r>
+        <w:rPr>
+          <w:rFonts w:ascii="Calibri" w:hAnsi="Calibri"/>
+          <w:b/>
+          <w:color w:val="1F4E5B"/>
+          <w:sz w:val="19"/>
+        </w:rPr>
+        <w:t>• Невербальное МЕТАСООБЩЕНИЕ: ««Обида — это яд, который ты пьешь сам, надеясь отравить другого. Сбрось этот рюкзак с камнями. Простить — не значит оправдать плохое. Простить — значит освободить СЕБЯ для жизни».»</w:t>
+        <w:br/>
+      </w:r>
+      <w:r>
+        <w:rPr>
+          <w:rFonts w:ascii="Calibri" w:hAnsi="Calibri"/>
+          <w:sz w:val="19"/>
+        </w:rPr>
+        <w:t>• Голос, темп и тело: Мягкий, глубокий гипнотический транс-тембр. Медленные паузы. Слова звучат веско и проникают глубоко в подсознание.</w:t>
+        <w:br/>
+      </w:r>
+      <w:r>
+        <w:rPr>
+          <w:rFonts w:ascii="Calibri" w:hAnsi="Calibri"/>
+          <w:i/>
+          <w:sz w:val="19"/>
+        </w:rPr>
+        <w:t>• Почему зритель досмотрит до конца: У зрителя отпускает застарелая боль 5–10-летней давности. Чувство легкости в теле заставляет идти дальше с утроенной силой.</w:t>
+      </w:r>
     </w:p>
     <w:p>
       <w:pPr>
-        <w:spacing w:after="100" w:line="276" w:lineRule="auto"/>
+        <w:spacing w:before="160" w:after="40"/>
       </w:pPr>
       <w:r>
         <w:rPr>
           <w:rFonts w:ascii="Calibri" w:hAnsi="Calibri"/>
           <w:b/>
-          <w:color w:val="222222"/>
+          <w:color w:val="0E6E5D"/>
           <w:sz w:val="22"/>
         </w:rPr>
-        <w:t xml:space="preserve">Интерактив: </w:t>
-      </w:r>
-      <w:r>
-        <w:rPr>
-          <w:rFonts w:ascii="Calibri" w:hAnsi="Calibri"/>
-          <w:i w:val="0"/>
-          <w:color w:val="333333"/>
-          <w:sz w:val="22"/>
-        </w:rPr>
-        <w:t>«Разделение территории» (выбор 1 сферы: здоровье, одежда, машина, рабочие дела) + Генерация фразы «Это твоя зона, я доверяю» без нотаций.</w:t>
+        <w:t>1. ТЕКСТ СУФЛЁРА ДЛЯ ВИДЕО АНАТОЛИЯ ФЁДОРОВА (4 МИН)</w:t>
       </w:r>
     </w:p>
     <w:p>
       <w:pPr>
-        <w:spacing w:before="320" w:after="120"/>
+        <w:spacing w:after="80" w:line="276" w:lineRule="auto"/>
+      </w:pPr>
+      <w:r>
+        <w:rPr>
+          <w:rFonts w:ascii="Calibri" w:hAnsi="Calibri"/>
+          <w:i/>
+          <w:sz w:val="20"/>
+        </w:rPr>
+        <w:t>«Здравствуйте. С вами Анатолий Фёдоров. Сегодня мы снимем самый тяжелый груз, который годами тянет семью на дно — накопленные глухие обиды.</w:t>
+        <w:br/>
+        <w:br/>
+        <w:t>Вы наверняка замечали: ссора начинается из-за ерунды, но через две минуты вы уже припоминаете друг другу отпуск трехлетней давности, слова свекрови на свадьбе и прошлогодний испорченный праздник.</w:t>
+        <w:br/>
+        <w:br/>
+        <w:t>Почему так происходит?</w:t>
+        <w:br/>
+        <w:t>Потому что невысказанная обида никуда не исчезает. Она капсулируется в теле в виде мышечных зажимов в шее и груди, и ждет первой искры, чтобы взорваться.</w:t>
+        <w:br/>
+        <w:br/>
+        <w:t>Жить с человеком и вести список его прегрешений — это как таскать за спиной мешок с тухлой рыбой и удивляться, почему в доме дурно пахнет.</w:t>
+        <w:br/>
+        <w:br/>
+        <w:t>Прощение — это не подарок партнеру. Это освобождение вашего собственного сердца от яда.</w:t>
+        <w:br/>
+        <w:br/>
+        <w:t>Под этим видео я прикрепил для вас мощную гипнотическую аудиопрактику «Амнистия обид: оставляем прошлое за порогом» (11 мин). Наденьте наушники, закройте глаза и позвольте себе сбросить этот груз. Сделайте это прямо сейчас.»</w:t>
+      </w:r>
+    </w:p>
+    <w:p>
+      <w:pPr>
+        <w:spacing w:before="240" w:after="60"/>
       </w:pPr>
       <w:r>
         <w:rPr>
           <w:rFonts w:ascii="Calibri" w:hAnsi="Calibri"/>
           <w:b/>
           <w:color w:val="1F4E5B"/>
-          <w:sz w:val="30"/>
+          <w:sz w:val="25"/>
         </w:rPr>
-        <w:t>6. УРОК 4: «ПРЯМОЙ РАЗГОВОР И АМНИСТИЯ СТАРЫХ СЧЕТОВ»</w:t>
+        <w:t>УРОК 4: МЯГКИЙ СТАРТ: КАК ГОВОРИТЬ О СВОИХ ЖЕЛАНИЯХ БЕЗ ПРЕТЕНЗИЙ</w:t>
       </w:r>
     </w:p>
     <w:p>
       <w:pPr>
-        <w:spacing w:after="100" w:line="276" w:lineRule="auto"/>
+        <w:spacing w:before="120" w:after="80"/>
+        <w:ind w:left="288"/>
       </w:pPr>
       <w:r>
         <w:rPr>
           <w:rFonts w:ascii="Calibri" w:hAnsi="Calibri"/>
           <w:b/>
-          <w:color w:val="222222"/>
-          <w:sz w:val="22"/>
+          <w:color w:val="C0392B"/>
+          <w:sz w:val="20"/>
         </w:rPr>
-        <w:t xml:space="preserve">Параметры: </w:t>
+        <w:t>🎬 РЕЖИССЁРСКАЯ КАРТА СПИКЕРА (КАК ВЕСТИ ЭТОТ УРОК ДЛЯ 100% ДОХОДИМОСТИ):</w:t>
+        <w:br/>
       </w:r>
       <w:r>
         <w:rPr>
           <w:rFonts w:ascii="Calibri" w:hAnsi="Calibri"/>
-          <w:i w:val="0"/>
-          <w:color w:val="333333"/>
-          <w:sz w:val="22"/>
+          <w:b/>
+          <w:sz w:val="19"/>
         </w:rPr>
-        <w:t>Экран 30 (out/client/30_lesson4.html) | Научная база: Готтман (Softened Startup, Repair Attempts)</w:t>
+        <w:t>• Роль спикера: Мастер дипломатии и коммуникации / Архитектор диалога</w:t>
+        <w:br/>
       </w:r>
-    </w:p>
-    <w:tbl>
-      <w:tblPr>
-        <w:tblW w:type="auto" w:w="0"/>
-        <w:jc w:val="center"/>
-        <w:tblLook w:firstColumn="1" w:firstRow="1" w:lastColumn="0" w:lastRow="0" w:noHBand="0" w:noVBand="1" w:val="04A0"/>
-      </w:tblPr>
-      <w:tblGrid>
-        <w:gridCol w:w="9360"/>
-      </w:tblGrid>
-      <w:tr>
-        <w:tc>
-          <w:tcPr>
-            <w:tcW w:type="dxa" w:w="9360"/>
-            <w:shd w:val="clear" w:color="auto" w:fill="F3F6F5"/>
-          </w:tcPr>
-          <w:p>
-            <w:pPr>
-              <w:spacing w:before="120" w:after="40" w:line="276" w:lineRule="auto"/>
-            </w:pPr>
-            <w:r>
-              <w:rPr>
-                <w:rFonts w:ascii="Calibri" w:hAnsi="Calibri"/>
-                <w:b/>
-                <w:color w:val="1F4E5B"/>
-                <w:sz w:val="21"/>
-              </w:rPr>
-              <w:t>🎙 Текст для суфлёра (видео):</w:t>
-              <w:br/>
-            </w:r>
-            <w:r>
-              <w:rPr>
-                <w:rFonts w:ascii="Calibri" w:hAnsi="Calibri"/>
-                <w:i/>
-                <w:color w:val="243139"/>
-                <w:sz w:val="21"/>
-              </w:rPr>
-              <w:t xml:space="preserve">Здравствуйте. Это четвертый урок. </w:t>
-              <w:br/>
-              <w:t>Сегодня мы сделаем главный шаг — научимся говорить о своей усталости и боли прямо, не скатываясь в скандал, и закроем старые счета.</w:t>
-              <w:br/>
-              <w:br/>
-              <w:t xml:space="preserve">Вспомните: почему большинство разговоров заканчиваются ссорой в первые три минуты? </w:t>
-              <w:br/>
-              <w:t xml:space="preserve">Потому что вместо конкретного факта звучит критика личности: «Ты вечно забываешь», «Ты ни о ком не думаешь». </w:t>
-              <w:br/>
-              <w:t>Слова «вечно» и «никогда» сразу включают у мужчины глухую оборону.</w:t>
-              <w:br/>
-              <w:br/>
-              <w:t xml:space="preserve">А вторая беда — это «архив старых обид». </w:t>
-              <w:br/>
-              <w:t xml:space="preserve">Когда обычный спор о чашке вдруг превращается в припоминание 2018 года: «А помнишь, как ты тогда поступил?!». </w:t>
-              <w:br/>
-              <w:t xml:space="preserve">Вы держитесь за этот архив, потому что вам кажется: чувство вины заставит его исправиться. </w:t>
-              <w:br/>
-              <w:t>Но в реальности виноватый мужчина просто теряет к вам любое влечение и закрывается еще глубже.</w:t>
-              <w:br/>
-              <w:br/>
-              <w:t>Сегодня мы применим формулу взрослого разговора СПА из трех простых частей:</w:t>
-              <w:br/>
-              <w:t>1. Один сухой факт сегодняшнего дня (без слов «вечно»).</w:t>
-              <w:br/>
-              <w:t>2. Что со мной происходит (моя усталость или боль, без обвинений).</w:t>
-              <w:br/>
-              <w:t>3. О каком конкретном действии я прошу — с полным правом для него сказать «нет».</w:t>
-              <w:br/>
-              <w:br/>
-              <w:t>Когда в просьбе есть право на отказ — исчезает давление. И только тогда у мужчины появляется желание помочь.</w:t>
-              <w:br/>
-              <w:br/>
-              <w:t xml:space="preserve">Внизу под видео вас ждет речевой тренажер: напишите вашу обычную претензию, и попутчик переведет ее в чистую взрослую формулу. </w:t>
-              <w:br/>
-              <w:t xml:space="preserve">А перед этим — послушайте аудиопрактику на снятие кома в горле и сброс старых обид. </w:t>
-              <w:br/>
-              <w:t>Спуститесь вниз.</w:t>
-            </w:r>
-          </w:p>
-        </w:tc>
-      </w:tr>
-    </w:tbl>
-    <w:p>
-      <w:pPr>
-        <w:spacing w:after="120"/>
-      </w:pPr>
+      <w:r>
+        <w:rPr>
+          <w:rFonts w:ascii="Calibri" w:hAnsi="Calibri"/>
+          <w:sz w:val="19"/>
+        </w:rPr>
+        <w:t>• Базовая эмоция: Элегантная легкость, уверенная дипломатия, практический блеск</w:t>
+        <w:br/>
+      </w:r>
+      <w:r>
+        <w:rPr>
+          <w:rFonts w:ascii="Calibri" w:hAnsi="Calibri"/>
+          <w:b/>
+          <w:color w:val="1F4E5B"/>
+          <w:sz w:val="19"/>
+        </w:rPr>
+        <w:t>• Невербальное МЕТАСООБЩЕНИЕ: ««Любую правду можно сказать так, что партнер захочет тебя обнять, а не защищаться. Я дам тебе формулу из 3 шагов, которая открывает любые закрытые двери».»</w:t>
+        <w:br/>
+      </w:r>
+      <w:r>
+        <w:rPr>
+          <w:rFonts w:ascii="Calibri" w:hAnsi="Calibri"/>
+          <w:sz w:val="19"/>
+        </w:rPr>
+        <w:t>• Голос, темп и тело: Четкая, структурированная, доброжелательная речь. Интонация мудрого дипломата. Наглядные примеры «Как сказать неправильно ➔ Как сказать правильно».</w:t>
+        <w:br/>
+      </w:r>
+      <w:r>
+        <w:rPr>
+          <w:rFonts w:ascii="Calibri" w:hAnsi="Calibri"/>
+          <w:i/>
+          <w:sz w:val="19"/>
+        </w:rPr>
+        <w:t>• Почему зритель досмотрит до конца: Зритель видит конкретные речевые скрипты, которые сразу же убирают барьер в общении.</w:t>
+      </w:r>
     </w:p>
     <w:p>
       <w:pPr>
-        <w:spacing w:after="100" w:line="276" w:lineRule="auto"/>
+        <w:spacing w:before="160" w:after="40"/>
       </w:pPr>
       <w:r>
         <w:rPr>
           <w:rFonts w:ascii="Calibri" w:hAnsi="Calibri"/>
           <w:b/>
-          <w:color w:val="222222"/>
+          <w:color w:val="0E6E5D"/>
           <w:sz w:val="22"/>
         </w:rPr>
-        <w:t xml:space="preserve">Аудиопрактика 2: </w:t>
-      </w:r>
-      <w:r>
-        <w:rPr>
-          <w:rFonts w:ascii="Calibri" w:hAnsi="Calibri"/>
-          <w:i w:val="0"/>
-          <w:color w:val="333333"/>
-          <w:sz w:val="22"/>
-        </w:rPr>
-        <w:t>«Амнистия обид: оставляем прошлое за порогом» (11 минут). Снятие зажима с горла и освобождение диафрагмы.</w:t>
+        <w:t>1. ТЕКСТ СУФЛЁРА ДЛЯ ВИДЕО АНАТОЛИЯ ФЁДОРОВА (4.5 МИН)</w:t>
       </w:r>
     </w:p>
     <w:p>
       <w:pPr>
-        <w:spacing w:after="100" w:line="276" w:lineRule="auto"/>
+        <w:spacing w:after="80" w:line="276" w:lineRule="auto"/>
       </w:pPr>
       <w:r>
         <w:rPr>
           <w:rFonts w:ascii="Calibri" w:hAnsi="Calibri"/>
-          <w:b/>
-          <w:color w:val="222222"/>
-          <w:sz w:val="22"/>
+          <w:i/>
+          <w:sz w:val="20"/>
         </w:rPr>
-        <w:t xml:space="preserve">Интерактив: </w:t>
-      </w:r>
-      <w:r>
-        <w:rPr>
-          <w:rFonts w:ascii="Calibri" w:hAnsi="Calibri"/>
-          <w:i w:val="0"/>
-          <w:color w:val="333333"/>
-          <w:sz w:val="22"/>
-        </w:rPr>
-        <w:t>«Речевой переводчик СПА» (Претензия ➔ Чистая формула: Факт + Чувство + Просьба с правом на отказ).</w:t>
+        <w:t>«Здравствуйте. С вами Анатолий Фёдоров. Готтман доказал: в 96% случаев то, как начнется разговор в первые три минуты, определяет то, как он закончится.</w:t>
+        <w:br/>
+        <w:br/>
+        <w:t>Если вы начинаете с «жесткого старта» (упрек, обвинение, слово «ты вечно» или «ты никогда») — разговор гарантированно закончится скандалом или закрытой дверью.</w:t>
+        <w:br/>
+        <w:br/>
+        <w:t>Сегодня мы освоим «Мягкий старт» по формуле «Я-сообщение» из 3 элементов:</w:t>
+        <w:br/>
+        <w:t>1. Описание факта без оценки: Вместо «Ты опять забил на дом» ➔ «Я вижу, что посуда осталась в раковине».</w:t>
+        <w:br/>
+        <w:t>2. Мое чувство: «Я очень устал(а) сегодня и чувствую бессилие».</w:t>
+        <w:br/>
+        <w:t>3. Конкретная позитивная просьба: «Помоги мне, пожалуйста, помой ее прямо сейчас, чтобы мы могли спокойно попить чай вместе».</w:t>
+        <w:br/>
+        <w:br/>
+        <w:t>Разница колоссальная: в первом случае партнер слышит «Ты плохой», во втором — «Мне нужна твоя помощь».</w:t>
+        <w:br/>
+        <w:br/>
+        <w:t>Под видео выполните интерактивный тренажер «Переводчик с языка претензий на язык близости» и переходите к финальному Уроку 5.»</w:t>
       </w:r>
     </w:p>
     <w:p>
       <w:pPr>
-        <w:spacing w:before="320" w:after="120"/>
+        <w:spacing w:before="240" w:after="60"/>
       </w:pPr>
       <w:r>
         <w:rPr>
           <w:rFonts w:ascii="Calibri" w:hAnsi="Calibri"/>
           <w:b/>
           <w:color w:val="1F4E5B"/>
-          <w:sz w:val="30"/>
+          <w:sz w:val="25"/>
         </w:rPr>
-        <w:t>7. УРОК 5: «НОВЫЕ ПРАВИЛА ЖИЗНИ И ЗАЩИТА ОТ ОТКАТОВ»</w:t>
+        <w:t>УРОК 5: СОЮЗ ДВУХ СВОБОДНЫХ: ВОЗВРАЩЕНИЕ ТЕПЛА, ПРИКОСНОВЕНИЙ И ФЛИРТА</w:t>
       </w:r>
     </w:p>
     <w:p>
       <w:pPr>
-        <w:spacing w:after="100" w:line="276" w:lineRule="auto"/>
+        <w:spacing w:before="120" w:after="80"/>
+        <w:ind w:left="288"/>
       </w:pPr>
       <w:r>
         <w:rPr>
           <w:rFonts w:ascii="Calibri" w:hAnsi="Calibri"/>
           <w:b/>
-          <w:color w:val="222222"/>
-          <w:sz w:val="22"/>
+          <w:color w:val="C0392B"/>
+          <w:sz w:val="20"/>
         </w:rPr>
-        <w:t xml:space="preserve">Параметры: </w:t>
+        <w:t>🎬 РЕЖИССЁРСКАЯ КАРТА СПИКЕРА (КАК ВЕСТИ ЭТОТ УРОК ДЛЯ 100% ДОХОДИМОСТИ):</w:t>
+        <w:br/>
       </w:r>
       <w:r>
         <w:rPr>
           <w:rFonts w:ascii="Calibri" w:hAnsi="Calibri"/>
-          <w:i w:val="0"/>
-          <w:color w:val="333333"/>
-          <w:sz w:val="22"/>
+          <w:b/>
+          <w:sz w:val="19"/>
         </w:rPr>
-        <w:t>Экран 31 (out/client/31_lesson5.html) | Научная база: Готтман (Bids for Connection) + НЛП Дилтса</w:t>
+        <w:t>• Роль спикера: Вдохновляющий хранитель очага / Наставник взрослой любви</w:t>
+        <w:br/>
       </w:r>
-    </w:p>
-    <w:tbl>
-      <w:tblPr>
-        <w:tblW w:type="auto" w:w="0"/>
-        <w:jc w:val="center"/>
-        <w:tblLook w:firstColumn="1" w:firstRow="1" w:lastColumn="0" w:lastRow="0" w:noHBand="0" w:noVBand="1" w:val="04A0"/>
-      </w:tblPr>
-      <w:tblGrid>
-        <w:gridCol w:w="9360"/>
-      </w:tblGrid>
-      <w:tr>
-        <w:tc>
-          <w:tcPr>
-            <w:tcW w:type="dxa" w:w="9360"/>
-            <w:shd w:val="clear" w:color="auto" w:fill="F3F6F5"/>
-          </w:tcPr>
-          <w:p>
-            <w:pPr>
-              <w:spacing w:before="120" w:after="40" w:line="276" w:lineRule="auto"/>
-            </w:pPr>
-            <w:r>
-              <w:rPr>
-                <w:rFonts w:ascii="Calibri" w:hAnsi="Calibri"/>
-                <w:b/>
-                <w:color w:val="1F4E5B"/>
-                <w:sz w:val="21"/>
-              </w:rPr>
-              <w:t>🎙 Текст для суфлёра (видео):</w:t>
-              <w:br/>
-            </w:r>
-            <w:r>
-              <w:rPr>
-                <w:rFonts w:ascii="Calibri" w:hAnsi="Calibri"/>
-                <w:i/>
-                <w:color w:val="243139"/>
-                <w:sz w:val="21"/>
-              </w:rPr>
-              <w:t>Здравствуйте. Это финальный урок курса «Мы вместе».</w:t>
-              <w:br/>
-              <w:br/>
-              <w:t xml:space="preserve">За эти четыре шага вы проделали огромную внутреннюю работу: </w:t>
-              <w:br/>
-              <w:t xml:space="preserve">Вернули себе дыхание и личный ресурс. </w:t>
-              <w:br/>
-              <w:t xml:space="preserve">Увидели тумблер ссор и научились брать паузу на 20 минут. </w:t>
-              <w:br/>
-              <w:t xml:space="preserve">Сняли с себя роль мамочки и вернули мужчине его территорию. </w:t>
-              <w:br/>
-              <w:t>И научились говорить прямо, оставив старые обиды в прошлом.</w:t>
-              <w:br/>
-              <w:br/>
-              <w:t xml:space="preserve">Теперь главное — закрепить эти изменения и защитить себя от откатов. </w:t>
-              <w:br/>
-              <w:t>Потому что привычки, которые строились 15 лет, будут пытаться вернуть вас в старую колею.</w:t>
-              <w:br/>
-              <w:br/>
-              <w:t xml:space="preserve">Джон Готтман доказал: счастливые пары держатся не на великих подвигах, а на ежедневных микро-ритуалах. </w:t>
-              <w:br/>
-              <w:t>Достаточно двух простых вещей:</w:t>
-              <w:br/>
-              <w:t xml:space="preserve">Первое — 10 минут утреннего кофе или вечернего чая без экранов и без обсуждения бытовых проблем. </w:t>
-              <w:br/>
-              <w:t>Второе — 10-секундное объятие при встрече с работы, без упреков с порога.</w:t>
-              <w:br/>
-              <w:br/>
-              <w:t xml:space="preserve">А если вдруг наступит откат и между вами снова вспыхнет искра раздражения — не пугайтесь. </w:t>
-              <w:br/>
-              <w:t>Откат — это нормально. Просто скажите кодовое правило: «Стоп, мы закипаем. Пауза 20 минут» — и разойдитесь по комнатам.</w:t>
-              <w:br/>
-              <w:br/>
-              <w:t xml:space="preserve">Внизу под видео вас ждет финальная аудиопрактика и генератор вашей «Семейной Карты опоры». </w:t>
-              <w:br/>
-              <w:t xml:space="preserve">Она объединит все ваши наработки курса в один простой экран, который останется у вас в телефоне навсегда. </w:t>
-              <w:br/>
-              <w:br/>
-              <w:t>Сделайте практику, соберите карту — и спасибо вам за эту работу.</w:t>
-            </w:r>
-          </w:p>
-        </w:tc>
-      </w:tr>
-    </w:tbl>
-    <w:p>
-      <w:pPr>
-        <w:spacing w:after="120"/>
-      </w:pPr>
+      <w:r>
+        <w:rPr>
+          <w:rFonts w:ascii="Calibri" w:hAnsi="Calibri"/>
+          <w:sz w:val="19"/>
+        </w:rPr>
+        <w:t>• Базовая эмоция: Теплая радость, романтическая глубина, зрелая устойчивость союза</w:t>
+        <w:br/>
+      </w:r>
+      <w:r>
+        <w:rPr>
+          <w:rFonts w:ascii="Calibri" w:hAnsi="Calibri"/>
+          <w:b/>
+          <w:color w:val="1F4E5B"/>
+          <w:sz w:val="19"/>
+        </w:rPr>
+        <w:t>• Невербальное МЕТАСООБЩЕНИЕ: ««Ваша семья — это лучшая команда на свете. Вы прошли проверку временем. Теперь верните в дом игру, свидания, прикосновения и радость быть вдвоем».»</w:t>
+        <w:br/>
+      </w:r>
+      <w:r>
+        <w:rPr>
+          <w:rFonts w:ascii="Calibri" w:hAnsi="Calibri"/>
+          <w:sz w:val="19"/>
+        </w:rPr>
+        <w:t>• Голос, темп и тело: Сердечный, глубокий, бархатный тембр с теплой улыбкой. Атмосфера уюта, вечернего камина и взаимной нежности.</w:t>
+        <w:br/>
+      </w:r>
+      <w:r>
+        <w:rPr>
+          <w:rFonts w:ascii="Calibri" w:hAnsi="Calibri"/>
+          <w:i/>
+          <w:sz w:val="19"/>
+        </w:rPr>
+        <w:t>• Почему зритель досмотрит до конца: Полное ощущение победы и обновления отношений. Желание сохранить эти ритуалы на долгие годы.</w:t>
+      </w:r>
     </w:p>
     <w:p>
       <w:pPr>
-        <w:spacing w:after="100" w:line="276" w:lineRule="auto"/>
+        <w:spacing w:before="160" w:after="40"/>
       </w:pPr>
       <w:r>
         <w:rPr>
           <w:rFonts w:ascii="Calibri" w:hAnsi="Calibri"/>
           <w:b/>
-          <w:color w:val="222222"/>
+          <w:color w:val="0E6E5D"/>
           <w:sz w:val="22"/>
         </w:rPr>
-        <w:t xml:space="preserve">Аудиопрактика 3: </w:t>
-      </w:r>
-      <w:r>
-        <w:rPr>
-          <w:rFonts w:ascii="Calibri" w:hAnsi="Calibri"/>
-          <w:i w:val="0"/>
-          <w:color w:val="333333"/>
-          <w:sz w:val="22"/>
-        </w:rPr>
-        <w:t>«Союз двух свободных: устойчивость и тепло» (12 минут). Фиксация личного суверенитета и внутреннего покоя.</w:t>
+        <w:t>1. ТЕКСТ СУФЛЁРА ДЛЯ ВИДЕО АНАТОЛИЯ ФЁДОРОВА (4.5 МИН)</w:t>
       </w:r>
     </w:p>
     <w:p>
       <w:pPr>
-        <w:spacing w:after="100" w:line="276" w:lineRule="auto"/>
+        <w:spacing w:after="80" w:line="276" w:lineRule="auto"/>
       </w:pPr>
       <w:r>
         <w:rPr>
           <w:rFonts w:ascii="Calibri" w:hAnsi="Calibri"/>
-          <w:b/>
-          <w:color w:val="222222"/>
-          <w:sz w:val="22"/>
+          <w:i/>
+          <w:sz w:val="20"/>
         </w:rPr>
-        <w:t xml:space="preserve">Интерактив и финал: </w:t>
-      </w:r>
-      <w:r>
-        <w:rPr>
-          <w:rFonts w:ascii="Calibri" w:hAnsi="Calibri"/>
-          <w:i w:val="0"/>
-          <w:color w:val="333333"/>
-          <w:sz w:val="22"/>
-        </w:rPr>
-        <w:t>Генератор «Семейной Карты опоры» (сборка 5 блоков в 1 экран) + Оффер персонального психологического портрета пары и консультации Анатолия Фёдорова (10 000 ₽).</w:t>
+        <w:t>«Здравствуйте. С вами Анатолий Фёдоров. Мы подошли к главному итогу нашего курса.</w:t>
+        <w:br/>
+        <w:br/>
+        <w:t>За эти дни вы проделали колоссальную работу: остановили разрушительный цикл ссор, освоили паузу 20 минут, сбросили старые обиды и научились говорить из мягкого старта.</w:t>
+        <w:br/>
+        <w:br/>
+        <w:t>Теперь настало время вернуть в ваш дом то, ради чего вы когда-то выбрали друг друга — тепло, тактильный контакт, смех и маленькие совместные ритуалы.</w:t>
+        <w:br/>
+        <w:br/>
+        <w:t>3 правила союза двух свободных взрослых людей:</w:t>
+        <w:br/>
+        <w:t>1. Ритуал 6-секундного поцелуя: перед выходом на работу и при встрече вечером целуйте друг друга не дежурно в щеку, а ровно 6 секунд. Готтман доказал, что за 6 секунд вырабатывается окситоцин — гормон доверия и привязанности.</w:t>
+        <w:br/>
+        <w:t>2. Свидание раз в две недели: без детей, без разговоров о ремонте, ипотеках и проблемах родственников. Только вы двое, как когда-то в начале пути.</w:t>
+        <w:br/>
+        <w:t>3. Карта семейной опоры: ежедневные 15 минут вечернего чая с выключенными телефонами.</w:t>
+        <w:br/>
+        <w:br/>
+        <w:t>Под видео вас ждет главная аудиопрактика курса «Союз двух свободных» и пакет из 4 бонусов (выход из бойкота, неловкость в спальне, границы с родственниками, разделение быта). Берегите друг друга, берегите свой союз. До встречи на наших программах!»</w:t>
       </w:r>
     </w:p>
     <w:p>
       <w:pPr>
-        <w:spacing w:before="320" w:after="120"/>
+        <w:spacing w:before="240" w:after="60"/>
       </w:pPr>
       <w:r>
         <w:rPr>
           <w:rFonts w:ascii="Calibri" w:hAnsi="Calibri"/>
           <w:b/>
           <w:color w:val="1F4E5B"/>
-          <w:sz w:val="30"/>
+          <w:sz w:val="25"/>
         </w:rPr>
-        <w:t>8. ПАКЕТ 4 БОНУСОВ (ЭКРАНЫ 32–35)</w:t>
+        <w:t>ПАКЕТ 4-Х УНИКАЛЬНЫХ БОНУСОВ КУРСА</w:t>
       </w:r>
     </w:p>
     <w:p>
       <w:pPr>
-        <w:spacing w:after="100" w:line="276" w:lineRule="auto"/>
+        <w:spacing w:before="160" w:after="40"/>
       </w:pPr>
       <w:r>
         <w:rPr>
           <w:rFonts w:ascii="Calibri" w:hAnsi="Calibri"/>
           <w:b/>
-          <w:color w:val="222222"/>
+          <w:color w:val="0E6E5D"/>
           <w:sz w:val="22"/>
         </w:rPr>
-        <w:t xml:space="preserve">Бонус 1: «Если он молчит третий день: выход из бойкота» — </w:t>
+        <w:t>БОНУС 1: «Выход из бойкота: как растопить лед после многодневной молчанки»</w:t>
       </w:r>
+    </w:p>
+    <w:p>
+      <w:pPr>
+        <w:spacing w:after="80" w:line="276" w:lineRule="auto"/>
+      </w:pPr>
       <w:r>
         <w:rPr>
           <w:rFonts w:ascii="Calibri" w:hAnsi="Calibri"/>
           <w:i w:val="0"/>
-          <w:color w:val="333333"/>
-          <w:sz w:val="22"/>
+          <w:sz w:val="20"/>
         </w:rPr>
-        <w:t>Экран 32 (32_bonus1.html). Разбор мужской молчанки (почему закрывается), протокол «Нейтральный мостик» (3 фразы без унизительных извинений) + ИИ-подбор первой фразы.</w:t>
+        <w:t>• Пошаговый алгоритм первого шага: 3 безопасные фразы, которые снимают напряжение без унижения.</w:t>
+        <w:br/>
+        <w:t>• Правило нейтральной территории: как начать разговор не в спальне и не на кухне.</w:t>
+        <w:br/>
+        <w:t>• Что делать, если партнер продолжает упорно молчать: техника мягкого моста.</w:t>
       </w:r>
     </w:p>
     <w:p>
       <w:pPr>
-        <w:spacing w:after="100" w:line="276" w:lineRule="auto"/>
+        <w:spacing w:before="160" w:after="40"/>
       </w:pPr>
       <w:r>
         <w:rPr>
           <w:rFonts w:ascii="Calibri" w:hAnsi="Calibri"/>
           <w:b/>
-          <w:color w:val="222222"/>
+          <w:color w:val="0E6E5D"/>
           <w:sz w:val="22"/>
         </w:rPr>
-        <w:t xml:space="preserve">Бонус 2: «Неловкость в спальне: как вернуть прикосновения» — </w:t>
+        <w:t>БОНУС 2: «Неловкость в спальне: как вернуть влечение и тактильность после долгой паузы»</w:t>
       </w:r>
+    </w:p>
+    <w:p>
+      <w:pPr>
+        <w:spacing w:after="80" w:line="276" w:lineRule="auto"/>
+      </w:pPr>
       <w:r>
         <w:rPr>
           <w:rFonts w:ascii="Calibri" w:hAnsi="Calibri"/>
           <w:i w:val="0"/>
-          <w:color w:val="333333"/>
-          <w:sz w:val="22"/>
+          <w:sz w:val="20"/>
         </w:rPr>
-        <w:t>Экран 33 (33_bonus2.html). Снятие стыда и неловкости в спальне. Техника 3 микро-шагов СПА (прикосновение без ожидания обязательного секса).</w:t>
+        <w:t>• Техника постепенного сенсорного сближения без давления на результат.</w:t>
+        <w:br/>
+        <w:t>• Как снять телесный зажим и стыд перед партнером после лет охлаждения.</w:t>
+        <w:br/>
+        <w:t>• 3 ритуала возвращения несексуальной нежности (массаж, объятия, прикосновения).</w:t>
       </w:r>
     </w:p>
     <w:p>
       <w:pPr>
-        <w:spacing w:after="100" w:line="276" w:lineRule="auto"/>
+        <w:spacing w:before="160" w:after="40"/>
       </w:pPr>
       <w:r>
         <w:rPr>
           <w:rFonts w:ascii="Calibri" w:hAnsi="Calibri"/>
           <w:b/>
-          <w:color w:val="222222"/>
+          <w:color w:val="0E6E5D"/>
           <w:sz w:val="22"/>
         </w:rPr>
-        <w:t xml:space="preserve">Бонус 3: «Вмешательство родственников: границы без войны» — </w:t>
+        <w:t>БОНУС 3: «Границы с родственниками: как защитить семью от вмешательства родителей»</w:t>
       </w:r>
+    </w:p>
+    <w:p>
+      <w:pPr>
+        <w:spacing w:after="80" w:line="276" w:lineRule="auto"/>
+      </w:pPr>
       <w:r>
         <w:rPr>
           <w:rFonts w:ascii="Calibri" w:hAnsi="Calibri"/>
           <w:i w:val="0"/>
-          <w:color w:val="333333"/>
-          <w:sz w:val="22"/>
+          <w:sz w:val="20"/>
         </w:rPr>
-        <w:t>Экран 34 (34_bonus3.html). Границы со свекровью и тёщей. Формула СПА «Единый фронт» (как договориться с мужем, чтобы он сам выставлял границы родителям).</w:t>
+        <w:t>• Правило коалиции пары: муж и жена всегда на первом месте перед родительскими семьями.</w:t>
+        <w:br/>
+        <w:t>• Скрипты вежливого, но твердого отказа от непрошеных советов свекрови и тещи.</w:t>
+        <w:br/>
+        <w:t>• Как поддержать супруга, когда его критикуют ваши родители.</w:t>
       </w:r>
     </w:p>
     <w:p>
       <w:pPr>
-        <w:spacing w:after="100" w:line="276" w:lineRule="auto"/>
+        <w:spacing w:before="160" w:after="40"/>
       </w:pPr>
       <w:r>
         <w:rPr>
           <w:rFonts w:ascii="Calibri" w:hAnsi="Calibri"/>
           <w:b/>
-          <w:color w:val="222222"/>
+          <w:color w:val="0E6E5D"/>
           <w:sz w:val="22"/>
         </w:rPr>
-        <w:t xml:space="preserve">Бонус 4: «Разделение быта: как не быть прислугой» — </w:t>
+        <w:t>БОНУС 4: «Разделение быта без скандалов: алгоритм семейного пакта»</w:t>
       </w:r>
+    </w:p>
+    <w:p>
+      <w:pPr>
+        <w:spacing w:after="80" w:line="276" w:lineRule="auto"/>
+      </w:pPr>
       <w:r>
         <w:rPr>
           <w:rFonts w:ascii="Calibri" w:hAnsi="Calibri"/>
           <w:i w:val="0"/>
-          <w:color w:val="333333"/>
-          <w:sz w:val="22"/>
+          <w:sz w:val="20"/>
         </w:rPr>
-        <w:t>Экран 35 (35_bonus4.html). Инвентаризация невидимого домашнего труда, свод правил «Мужская/Женская зона» и алгоритм снятия с себя сверхурочной домашней работы.</w:t>
+        <w:t>• Техника инвентаризации домашней нагрузки: наглядное распределение обязанностей.</w:t>
+        <w:br/>
+        <w:t>• Как перестать быть вечным домашним надзирателем и контролером.</w:t>
+        <w:br/>
+        <w:t>• Внедрение игровых правил и делегирования домашних дел.</w:t>
       </w:r>
     </w:p>
     <w:sectPr>

</xml_diff>